<commit_message>
modulo domanda socio updated
</commit_message>
<xml_diff>
--- a/pdf/modulo_domanda_socio.docx
+++ b/pdf/modulo_domanda_socio.docx
@@ -205,9 +205,10 @@
       </w:r>
       <w:r>
         <w:rPr>
-          <w:rFonts w:ascii="Noto Kufi Arabic" w:hAnsi="Noto Kufi Arabic" w:eastAsia="Noto Kufi Arabic" w:cs="Noto Kufi Arabic"/>
+          <w:rFonts w:ascii="Noto Kufi Arabic" w:hAnsi="Noto Kufi Arabic" w:cs="Noto Kufi Arabic"/>
           <w:sz w:val="32"/>
           <w:szCs w:val="32"/>
+          <w:highlight w:val="none"/>
           <w:lang w:val="it-IT"/>
         </w:rPr>
       </w:r>
@@ -281,9 +282,11 @@
       </w:r>
       <w:r>
         <w:rPr>
-          <w:rFonts w:ascii="Noto Kufi Arabic" w:hAnsi="Noto Kufi Arabic" w:cs="Noto Kufi Arabic"/>
+          <w:rFonts w:ascii="Noto Kufi Arabic" w:hAnsi="Noto Kufi Arabic" w:eastAsia="Noto Kufi Arabic" w:cs="Noto Kufi Arabic"/>
+          <w:color w:val="151616"/>
           <w:sz w:val="24"/>
-          <w:szCs w:val="10"/>
+          <w:szCs w:val="24"/>
+          <w:highlight w:val="none"/>
           <w:lang w:val="it-IT"/>
         </w:rPr>
       </w:r>
@@ -336,8 +339,7 @@
           <w:color w:val="151616"/>
           <w:spacing w:val="-2"/>
           <w:sz w:val="16"/>
-          <w:szCs w:val="14"/>
-          <w:highlight w:val="none"/>
+          <w:szCs w:val="16"/>
           <w:lang w:val="it-IT"/>
         </w:rPr>
       </w:r>
@@ -474,16 +476,6 @@
       </w:r>
       <w:r>
         <w:rPr>
-          <w:rFonts w:ascii="Noto Kufi Arabic" w:hAnsi="Noto Kufi Arabic" w:cs="Noto Kufi Arabic"/>
-          <w:b w:val="0"/>
-          <w:bCs w:val="0"/>
-          <w:sz w:val="24"/>
-          <w:szCs w:val="24"/>
-          <w:lang w:val="it-IT"/>
-        </w:rPr>
-      </w:r>
-      <w:r>
-        <w:rPr>
           <w:rFonts w:ascii="Noto Kufi Arabic" w:hAnsi="Noto Kufi Arabic" w:eastAsia="Noto Kufi Arabic" w:cs="Noto Kufi Arabic"/>
           <w:b w:val="0"/>
           <w:bCs w:val="0"/>
@@ -495,6 +487,19 @@
           <w:lang w:val="it-IT"/>
         </w:rPr>
       </w:r>
+      <w:r>
+        <w:rPr>
+          <w:rFonts w:ascii="Noto Kufi Arabic" w:hAnsi="Noto Kufi Arabic" w:eastAsia="Noto Kufi Arabic" w:cs="Noto Kufi Arabic"/>
+          <w:b w:val="0"/>
+          <w:bCs w:val="0"/>
+          <w:color w:val="151616"/>
+          <w:spacing w:val="-2"/>
+          <w:sz w:val="24"/>
+          <w:szCs w:val="24"/>
+          <w:highlight w:val="none"/>
+          <w:lang w:val="it-IT"/>
+        </w:rPr>
+      </w:r>
     </w:p>
     <w:p>
       <w:pPr>
@@ -683,6 +688,11 @@
       </w:r>
       <w:r>
         <w:rPr>
+          <w:rFonts w:ascii="Noto Kufi Arabic" w:hAnsi="Noto Kufi Arabic" w:eastAsia="Noto Kufi Arabic" w:cs="Noto Kufi Arabic"/>
+          <w:b/>
+          <w:bCs/>
+          <w:color w:val="151616"/>
+          <w:spacing w:val="-2"/>
           <w:sz w:val="24"/>
           <w:szCs w:val="24"/>
           <w:lang w:val="it-IT"/>
@@ -901,7 +911,7 @@
       </w:r>
       <w:r>
         <w:rPr>
-          <w:rFonts w:ascii="Noto Kufi Arabic" w:hAnsi="Noto Kufi Arabic" w:eastAsia="Noto Kufi Arabic" w:cs="Noto Kufi Arabic"/>
+          <w:rFonts w:ascii="Noto Kufi Arabic" w:hAnsi="Noto Kufi Arabic" w:cs="Noto Kufi Arabic"/>
           <w:position w:val="2"/>
           <w:sz w:val="32"/>
           <w:szCs w:val="32"/>
@@ -1065,7 +1075,8 @@
       </w:r>
       <w:r>
         <w:rPr>
-          <w:rFonts w:ascii="Noto Kufi Arabic" w:hAnsi="Noto Kufi Arabic" w:cs="Noto Kufi Arabic"/>
+          <w:rFonts w:ascii="Noto Kufi Arabic" w:hAnsi="Noto Kufi Arabic" w:eastAsia="Noto Kufi Arabic" w:cs="Noto Kufi Arabic"/>
+          <w:color w:val="151616"/>
           <w:sz w:val="24"/>
           <w:szCs w:val="24"/>
           <w:lang w:val="it-IT"/>
@@ -1257,6 +1268,7 @@
       </w:r>
       <w:r>
         <w:rPr>
+          <w:rFonts w:ascii="Noto Kufi Arabic" w:hAnsi="Noto Kufi Arabic" w:cs="Noto Kufi Arabic"/>
           <w:sz w:val="24"/>
           <w:szCs w:val="24"/>
           <w:lang w:val="it-IT"/>
@@ -1389,6 +1401,8 @@
       </w:r>
       <w:r>
         <w:rPr>
+          <w:rFonts w:ascii="Noto Kufi Arabic" w:hAnsi="Noto Kufi Arabic" w:eastAsia="Noto Kufi Arabic" w:cs="Noto Kufi Arabic"/>
+          <w:color w:val="151616"/>
           <w:sz w:val="24"/>
           <w:szCs w:val="24"/>
           <w:lang w:val="it-IT"/>
@@ -1461,6 +1475,7 @@
       </w:r>
       <w:r>
         <w:rPr>
+          <w:rFonts w:ascii="Noto Kufi Arabic" w:hAnsi="Noto Kufi Arabic" w:cs="Noto Kufi Arabic"/>
           <w:sz w:val="24"/>
           <w:szCs w:val="24"/>
           <w:lang w:val="it-IT"/>
@@ -1617,14 +1632,6 @@
       </w:r>
       <w:r>
         <w:rPr>
-          <w:rFonts w:ascii="Noto Kufi Arabic" w:hAnsi="Noto Kufi Arabic" w:cs="Noto Kufi Arabic"/>
-          <w:sz w:val="24"/>
-          <w:szCs w:val="24"/>
-          <w:lang w:val="it-IT"/>
-        </w:rPr>
-      </w:r>
-      <w:r>
-        <w:rPr>
           <w:rFonts w:ascii="Noto Kufi Arabic" w:hAnsi="Noto Kufi Arabic" w:eastAsia="Noto Kufi Arabic" w:cs="Noto Kufi Arabic"/>
           <w:color w:val="151616"/>
           <w:spacing w:val="-2"/>
@@ -1634,6 +1641,17 @@
           <w:lang w:val="it-IT"/>
         </w:rPr>
       </w:r>
+      <w:r>
+        <w:rPr>
+          <w:rFonts w:ascii="Noto Kufi Arabic" w:hAnsi="Noto Kufi Arabic" w:eastAsia="Noto Kufi Arabic" w:cs="Noto Kufi Arabic"/>
+          <w:color w:val="151616"/>
+          <w:spacing w:val="-2"/>
+          <w:sz w:val="24"/>
+          <w:szCs w:val="24"/>
+          <w:highlight w:val="none"/>
+          <w:lang w:val="it-IT"/>
+        </w:rPr>
+      </w:r>
     </w:p>
     <w:p>
       <w:pPr>
@@ -1661,12 +1679,9 @@
       </w:r>
       <w:r>
         <w:rPr>
-          <w:rFonts w:ascii="Noto Kufi Arabic" w:hAnsi="Noto Kufi Arabic" w:eastAsia="Noto Kufi Arabic" w:cs="Noto Kufi Arabic"/>
-          <w:color w:val="151616"/>
-          <w:spacing w:val="-2"/>
+          <w:rFonts w:ascii="Noto Kufi Arabic" w:hAnsi="Noto Kufi Arabic" w:cs="Noto Kufi Arabic"/>
           <w:sz w:val="20"/>
           <w:szCs w:val="20"/>
-          <w:highlight w:val="none"/>
           <w:lang w:val="it-IT"/>
         </w:rPr>
       </w:r>
@@ -1711,15 +1726,6 @@
       </w:r>
       <w:r>
         <w:rPr>
-          <w:rFonts w:ascii="Noto Kufi Arabic" w:hAnsi="Noto Kufi Arabic" w:cs="Noto Kufi Arabic"/>
-          <w:b/>
-          <w:sz w:val="32"/>
-          <w:szCs w:val="32"/>
-          <w:lang w:val="it-IT"/>
-        </w:rPr>
-      </w:r>
-      <w:r>
-        <w:rPr>
           <w:rFonts w:ascii="Noto Kufi Arabic" w:hAnsi="Noto Kufi Arabic" w:eastAsia="Noto Kufi Arabic" w:cs="Noto Kufi Arabic"/>
           <w:b/>
           <w:bCs/>
@@ -1731,6 +1737,19 @@
           <w:lang w:val="it-IT"/>
         </w:rPr>
       </w:r>
+      <w:r>
+        <w:rPr>
+          <w:rFonts w:ascii="Noto Kufi Arabic" w:hAnsi="Noto Kufi Arabic" w:eastAsia="Noto Kufi Arabic" w:cs="Noto Kufi Arabic"/>
+          <w:b/>
+          <w:bCs/>
+          <w:color w:val="151616"/>
+          <w:spacing w:val="-2"/>
+          <w:sz w:val="32"/>
+          <w:szCs w:val="32"/>
+          <w:highlight w:val="none"/>
+          <w:lang w:val="it-IT"/>
+        </w:rPr>
+      </w:r>
     </w:p>
     <w:p>
       <w:pPr>
@@ -1761,18 +1780,6 @@
       </w:r>
       <w:r>
         <w:rPr>
-          <w:rFonts w:ascii="Noto Kufi Arabic" w:hAnsi="Noto Kufi Arabic" w:eastAsia="Noto Kufi Arabic" w:cs="Noto Kufi Arabic"/>
-          <w:b/>
-          <w:color w:val="151616"/>
-          <w:spacing w:val="-2"/>
-          <w:sz w:val="32"/>
-          <w:szCs w:val="32"/>
-          <w:highlight w:val="none"/>
-          <w:lang w:val="it-IT"/>
-        </w:rPr>
-      </w:r>
-      <w:r>
-        <w:rPr>
           <w:rFonts w:ascii="Noto Kufi Arabic" w:hAnsi="Noto Kufi Arabic" w:cs="Noto Kufi Arabic"/>
           <w:b/>
           <w:bCs/>
@@ -1781,6 +1788,16 @@
           <w:lang w:val="it-IT"/>
         </w:rPr>
       </w:r>
+      <w:r>
+        <w:rPr>
+          <w:rFonts w:ascii="Noto Kufi Arabic" w:hAnsi="Noto Kufi Arabic" w:cs="Noto Kufi Arabic"/>
+          <w:b/>
+          <w:bCs/>
+          <w:sz w:val="32"/>
+          <w:szCs w:val="32"/>
+          <w:lang w:val="it-IT"/>
+        </w:rPr>
+      </w:r>
     </w:p>
     <w:p>
       <w:pPr>
@@ -1803,7 +1820,27 @@
           <w:szCs w:val="22"/>
           <w:lang w:val="it-IT"/>
         </w:rPr>
-        <w:t xml:space="preserve">di essere ammessa/o </w:t>
+        <w:t xml:space="preserve">di essere </w:t>
+      </w:r>
+      <w:r>
+        <w:rPr>
+          <w:rFonts w:ascii="Noto Kufi Arabic" w:hAnsi="Noto Kufi Arabic" w:eastAsia="Noto Kufi Arabic" w:cs="Noto Kufi Arabic"/>
+          <w:color w:val="151616"/>
+          <w:sz w:val="22"/>
+          <w:szCs w:val="22"/>
+          <w:lang w:val="en"/>
+        </w:rPr>
+        <w:t xml:space="preserve">tesserato/a</w:t>
+      </w:r>
+      <w:r>
+        <w:rPr>
+          <w:rFonts w:ascii="Noto Kufi Arabic" w:hAnsi="Noto Kufi Arabic" w:eastAsia="Noto Kufi Arabic" w:cs="Noto Kufi Arabic"/>
+          <w:color w:val="151616"/>
+          <w:sz w:val="22"/>
+          <w:szCs w:val="22"/>
+          <w:lang w:val="it-IT"/>
+        </w:rPr>
+        <w:t xml:space="preserve"> </w:t>
       </w:r>
       <w:r>
         <w:rPr>
@@ -2288,20 +2325,20 @@
       </w:r>
       <w:r>
         <w:rPr>
-          <w:rFonts w:ascii="Noto Kufi Arabic" w:hAnsi="Noto Kufi Arabic" w:eastAsia="Noto Kufi Arabic" w:cs="Noto Kufi Arabic"/>
-          <w:sz w:val="22"/>
-          <w:szCs w:val="22"/>
-          <w:lang w:val="it-IT"/>
-        </w:rPr>
-      </w:r>
-      <w:r>
-        <w:rPr>
           <w:rFonts w:ascii="Noto Kufi Arabic" w:hAnsi="Noto Kufi Arabic" w:cs="Noto Kufi Arabic"/>
           <w:sz w:val="22"/>
           <w:szCs w:val="22"/>
           <w:lang w:val="it-IT"/>
         </w:rPr>
       </w:r>
+      <w:r>
+        <w:rPr>
+          <w:rFonts w:ascii="Noto Kufi Arabic" w:hAnsi="Noto Kufi Arabic" w:cs="Noto Kufi Arabic"/>
+          <w:sz w:val="22"/>
+          <w:szCs w:val="22"/>
+          <w:lang w:val="it-IT"/>
+        </w:rPr>
+      </w:r>
     </w:p>
     <w:p>
       <w:pPr>
@@ -2326,7 +2363,7 @@
       </w:r>
       <w:r>
         <w:rPr>
-          <w:rFonts w:ascii="Noto Kufi Arabic" w:hAnsi="Noto Kufi Arabic" w:eastAsia="Noto Kufi Arabic" w:cs="Noto Kufi Arabic"/>
+          <w:rFonts w:ascii="Noto Kufi Arabic" w:hAnsi="Noto Kufi Arabic" w:cs="Noto Kufi Arabic"/>
           <w:sz w:val="24"/>
           <w:szCs w:val="24"/>
           <w:lang w:val="it-IT"/>
@@ -2369,7 +2406,8 @@
       </w:r>
       <w:r>
         <w:rPr>
-          <w:rFonts w:ascii="Noto Kufi Arabic" w:hAnsi="Noto Kufi Arabic" w:cs="Noto Kufi Arabic"/>
+          <w:rFonts w:ascii="Noto Kufi Arabic" w:hAnsi="Noto Kufi Arabic" w:eastAsia="Noto Kufi Arabic" w:cs="Noto Kufi Arabic"/>
+          <w:color w:val="151616"/>
           <w:position w:val="1"/>
           <w:sz w:val="24"/>
           <w:szCs w:val="24"/>
@@ -2415,13 +2453,10 @@
       </w:r>
       <w:r>
         <w:rPr>
-          <w:rFonts w:ascii="Noto Kufi Arabic" w:hAnsi="Noto Kufi Arabic" w:eastAsia="Noto Kufi Arabic" w:cs="Noto Kufi Arabic"/>
-          <w:color w:val="151616"/>
-          <w:spacing w:val="-2"/>
+          <w:rFonts w:ascii="Noto Kufi Arabic" w:hAnsi="Noto Kufi Arabic" w:cs="Noto Kufi Arabic"/>
           <w:position w:val="1"/>
           <w:sz w:val="24"/>
           <w:szCs w:val="24"/>
-          <w:highlight w:val="none"/>
           <w:lang w:val="it-IT"/>
         </w:rPr>
       </w:r>
@@ -2584,11 +2619,9 @@
         <w:rPr>
           <w:rFonts w:ascii="Noto Kufi Arabic" w:hAnsi="Noto Kufi Arabic" w:eastAsia="Noto Kufi Arabic" w:cs="Noto Kufi Arabic"/>
           <w:color w:val="151616"/>
-          <w:spacing w:val="-2"/>
           <w:position w:val="1"/>
           <w:sz w:val="24"/>
           <w:szCs w:val="24"/>
-          <w:highlight w:val="none"/>
           <w:lang w:val="it-IT"/>
         </w:rPr>
       </w:r>
@@ -3297,6 +3330,8 @@
         <w:rPr>
           <w:rFonts w:ascii="Noto Kufi Arabic" w:hAnsi="Noto Kufi Arabic" w:eastAsia="Noto Kufi Arabic" w:cs="Noto Kufi Arabic"/>
           <w:color w:val="151616"/>
+          <w:spacing w:val="-2"/>
+          <w:position w:val="1"/>
           <w:sz w:val="24"/>
           <w:szCs w:val="24"/>
           <w:highlight w:val="none"/>
@@ -3350,9 +3385,11 @@
       </w:r>
       <w:r>
         <w:rPr>
-          <w:rFonts w:ascii="Noto Kufi Arabic" w:hAnsi="Noto Kufi Arabic" w:cs="Noto Kufi Arabic"/>
+          <w:rFonts w:ascii="Noto Kufi Arabic" w:hAnsi="Noto Kufi Arabic" w:eastAsia="Noto Kufi Arabic" w:cs="Noto Kufi Arabic"/>
           <w:b w:val="0"/>
           <w:bCs w:val="0"/>
+          <w:color w:val="151616"/>
+          <w:spacing w:val="-4"/>
           <w:sz w:val="24"/>
           <w:szCs w:val="24"/>
           <w:u w:val="none"/>
@@ -3501,9 +3538,9 @@
           <w:spacing w:val="-2"/>
           <w:sz w:val="24"/>
           <w:szCs w:val="24"/>
-          <w:lang w:val="it-IT"/>
-        </w:rPr>
-        <w:t xml:space="preserve">VOLONTARIO</w:t>
+          <w:lang w:val="en"/>
+        </w:rPr>
+        <w:t xml:space="preserve">TESSERATO</w:t>
       </w:r>
       <w:r>
         <w:rPr>
@@ -3738,8 +3775,20 @@
           <w:szCs w:val="24"/>
           <w:lang w:val="it-IT"/>
         </w:rPr>
-        <w:t xml:space="preserve">VOLONTARIO</w:t>
       </w:r>
+      <w:r>
+        <w:rPr>
+          <w:rFonts w:ascii="Noto Kufi Arabic" w:hAnsi="Noto Kufi Arabic" w:eastAsia="Noto Kufi Arabic" w:cs="Noto Kufi Arabic"/>
+          <w:b/>
+          <w:color w:val="151616"/>
+          <w:spacing w:val="-2"/>
+          <w:sz w:val="24"/>
+          <w:szCs w:val="24"/>
+          <w:lang w:val="en"/>
+        </w:rPr>
+        <w:t xml:space="preserve">TESSERATO</w:t>
+      </w:r>
+      <w:r/>
       <w:r>
         <w:rPr>
           <w:rFonts w:ascii="Noto Kufi Arabic" w:hAnsi="Noto Kufi Arabic" w:eastAsia="Noto Kufi Arabic" w:cs="Noto Kufi Arabic"/>
@@ -3827,8 +3876,10 @@
         <w:rPr>
           <w:rFonts w:ascii="Noto Kufi Arabic" w:hAnsi="Noto Kufi Arabic" w:cs="Noto Kufi Arabic"/>
           <w:b/>
+          <w:bCs/>
           <w:sz w:val="24"/>
           <w:szCs w:val="24"/>
+          <w:highlight w:val="none"/>
           <w:lang w:val="it-IT"/>
         </w:rPr>
       </w:r>
@@ -3974,8 +4025,20 @@
           <w:szCs w:val="24"/>
           <w:lang w:val="it-IT"/>
         </w:rPr>
-        <w:t xml:space="preserve">VOLONTARIO</w:t>
       </w:r>
+      <w:r>
+        <w:rPr>
+          <w:rFonts w:ascii="Noto Kufi Arabic" w:hAnsi="Noto Kufi Arabic" w:eastAsia="Noto Kufi Arabic" w:cs="Noto Kufi Arabic"/>
+          <w:b/>
+          <w:color w:val="151616"/>
+          <w:spacing w:val="-2"/>
+          <w:sz w:val="24"/>
+          <w:szCs w:val="24"/>
+          <w:lang w:val="en"/>
+        </w:rPr>
+        <w:t xml:space="preserve">TESSERATO</w:t>
+      </w:r>
+      <w:r/>
       <w:r>
         <w:rPr>
           <w:rFonts w:ascii="Noto Kufi Arabic" w:hAnsi="Noto Kufi Arabic" w:eastAsia="Noto Kufi Arabic" w:cs="Noto Kufi Arabic"/>
@@ -4212,8 +4275,20 @@
           <w:szCs w:val="24"/>
           <w:lang w:val="it-IT"/>
         </w:rPr>
-        <w:t xml:space="preserve">VOLONTARIO</w:t>
       </w:r>
+      <w:r>
+        <w:rPr>
+          <w:rFonts w:ascii="Noto Kufi Arabic" w:hAnsi="Noto Kufi Arabic" w:eastAsia="Noto Kufi Arabic" w:cs="Noto Kufi Arabic"/>
+          <w:b/>
+          <w:color w:val="151616"/>
+          <w:spacing w:val="-2"/>
+          <w:sz w:val="24"/>
+          <w:szCs w:val="24"/>
+          <w:lang w:val="en"/>
+        </w:rPr>
+        <w:t xml:space="preserve">TESSERATO</w:t>
+      </w:r>
+      <w:r/>
       <w:r>
         <w:rPr>
           <w:rFonts w:ascii="Noto Kufi Arabic" w:hAnsi="Noto Kufi Arabic" w:eastAsia="Noto Kufi Arabic" w:cs="Noto Kufi Arabic"/>
@@ -4556,6 +4631,7 @@
         <w:rPr>
           <w:rFonts w:ascii="Noto Kufi Arabic" w:hAnsi="Noto Kufi Arabic" w:eastAsia="Noto Kufi Arabic" w:cs="Noto Kufi Arabic"/>
           <w:b/>
+          <w:bCs/>
           <w:color w:val="151616"/>
           <w:spacing w:val="-5"/>
           <w:sz w:val="24"/>
@@ -4604,10 +4680,11 @@
       </w:r>
       <w:r>
         <w:rPr>
-          <w:rFonts w:ascii="Noto Kufi Arabic" w:hAnsi="Noto Kufi Arabic" w:eastAsia="Noto Kufi Arabic" w:cs="Noto Kufi Arabic"/>
+          <w:rFonts w:ascii="Noto Kufi Arabic" w:hAnsi="Noto Kufi Arabic" w:cs="Noto Kufi Arabic"/>
+          <w:b/>
+          <w:bCs/>
           <w:sz w:val="24"/>
           <w:szCs w:val="24"/>
-          <w:highlight w:val="none"/>
           <w:lang w:val="it-IT"/>
         </w:rPr>
       </w:r>
@@ -4939,8 +5016,8 @@
       <w:r>
         <w:rPr>
           <w:rFonts w:ascii="Noto Kufi Arabic" w:hAnsi="Noto Kufi Arabic" w:eastAsia="Noto Kufi Arabic" w:cs="Noto Kufi Arabic"/>
+          <w:bCs/>
           <w:i/>
-          <w:iCs/>
           <w:color w:val="151616"/>
           <w:sz w:val="22"/>
           <w:szCs w:val="22"/>
@@ -5108,7 +5185,7 @@
         <w:rPr>
           <w:rFonts w:ascii="Noto Kufi Arabic" w:hAnsi="Noto Kufi Arabic" w:cs="Noto Kufi Arabic"/>
           <w:sz w:val="22"/>
-          <w:szCs w:val="14"/>
+          <w:szCs w:val="22"/>
           <w:lang w:val="it-IT"/>
         </w:rPr>
       </w:r>
@@ -5211,7 +5288,7 @@
           <w:sz w:val="24"/>
           <w:szCs w:val="24"/>
           <w:highlight w:val="none"/>
-          <w:lang w:val="it-IT" w:bidi="en"/>
+          <w:lang w:val="it-IT"/>
         </w:rPr>
       </w:r>
       <w:r>

</xml_diff>